<commit_message>
Fukciók specifikálása röviden, meg nem teljesen kész állapotban
</commit_message>
<xml_diff>
--- a/Funkcionális specifikációk.docx
+++ b/Funkcionális specifikációk.docx
@@ -3231,6 +3231,1087 @@
           <w:lang w:val="hu-HU"/>
         </w:rPr>
         <w:t>hozzáférhetnek a csapathoz tartozó saját gyakorlatokhoz.</w:t>
+      </w:r>
+    </w:p>
+    <w:p>
+      <w:pPr>
+        <w:ind w:left="720"/>
+        <w:rPr>
+          <w:b/>
+          <w:bCs/>
+          <w:lang w:val="hu-HU"/>
+        </w:rPr>
+      </w:pPr>
+    </w:p>
+    <w:p>
+      <w:pPr>
+        <w:ind w:left="720"/>
+        <w:rPr>
+          <w:b/>
+          <w:bCs/>
+          <w:sz w:val="32"/>
+          <w:szCs w:val="32"/>
+          <w:u w:val="single"/>
+          <w:lang w:val="hu-HU"/>
+        </w:rPr>
+      </w:pPr>
+      <w:r>
+        <w:rPr>
+          <w:b/>
+          <w:bCs/>
+          <w:sz w:val="32"/>
+          <w:szCs w:val="32"/>
+          <w:u w:val="single"/>
+          <w:lang w:val="hu-HU"/>
+        </w:rPr>
+        <w:t xml:space="preserve"> Funkcionális specifikáció – Statisztikák megtekintése</w:t>
+      </w:r>
+    </w:p>
+    <w:p>
+      <w:pPr>
+        <w:ind w:left="720"/>
+        <w:rPr>
+          <w:b/>
+          <w:bCs/>
+          <w:lang w:val="hu-HU"/>
+        </w:rPr>
+      </w:pPr>
+    </w:p>
+    <w:p>
+      <w:pPr>
+        <w:ind w:left="720"/>
+        <w:rPr>
+          <w:b/>
+          <w:bCs/>
+          <w:lang w:val="hu-HU"/>
+        </w:rPr>
+      </w:pPr>
+      <w:r>
+        <w:rPr>
+          <w:b/>
+          <w:bCs/>
+          <w:lang w:val="hu-HU"/>
+        </w:rPr>
+        <w:t>1. A funkció célja</w:t>
+      </w:r>
+    </w:p>
+    <w:p>
+      <w:pPr>
+        <w:ind w:left="720"/>
+        <w:rPr>
+          <w:b/>
+          <w:bCs/>
+          <w:lang w:val="hu-HU"/>
+        </w:rPr>
+      </w:pPr>
+    </w:p>
+    <w:p>
+      <w:pPr>
+        <w:ind w:left="720"/>
+        <w:rPr>
+          <w:b/>
+          <w:bCs/>
+          <w:lang w:val="hu-HU"/>
+        </w:rPr>
+      </w:pPr>
+      <w:r>
+        <w:rPr>
+          <w:b/>
+          <w:bCs/>
+          <w:lang w:val="hu-HU"/>
+        </w:rPr>
+        <w:t>A funkció célja, hogy a felhasználók a rendszerben rögzített adatok alapján áttekintsék a csapat és az egyes játékosok teljesítményét, valamint az edzéslátogatottságot.</w:t>
+      </w:r>
+    </w:p>
+    <w:p>
+      <w:pPr>
+        <w:ind w:left="720"/>
+        <w:rPr>
+          <w:b/>
+          <w:bCs/>
+          <w:lang w:val="hu-HU"/>
+        </w:rPr>
+      </w:pPr>
+    </w:p>
+    <w:p>
+      <w:pPr>
+        <w:ind w:left="720"/>
+        <w:rPr>
+          <w:b/>
+          <w:bCs/>
+          <w:lang w:val="hu-HU"/>
+        </w:rPr>
+      </w:pPr>
+      <w:r>
+        <w:rPr>
+          <w:b/>
+          <w:bCs/>
+          <w:lang w:val="hu-HU"/>
+        </w:rPr>
+        <w:t xml:space="preserve"> 2. Csapatszintű statisztikák</w:t>
+      </w:r>
+    </w:p>
+    <w:p>
+      <w:pPr>
+        <w:ind w:left="720"/>
+        <w:rPr>
+          <w:b/>
+          <w:bCs/>
+          <w:lang w:val="hu-HU"/>
+        </w:rPr>
+      </w:pPr>
+    </w:p>
+    <w:p>
+      <w:pPr>
+        <w:ind w:left="720"/>
+        <w:rPr>
+          <w:b/>
+          <w:bCs/>
+          <w:lang w:val="hu-HU"/>
+        </w:rPr>
+      </w:pPr>
+      <w:r>
+        <w:rPr>
+          <w:b/>
+          <w:bCs/>
+          <w:lang w:val="hu-HU"/>
+        </w:rPr>
+        <w:t>A rendszer megjeleníti a csapat legfontosabb statisztikáit, például:</w:t>
+      </w:r>
+    </w:p>
+    <w:p>
+      <w:pPr>
+        <w:ind w:left="720"/>
+        <w:rPr>
+          <w:b/>
+          <w:bCs/>
+          <w:lang w:val="hu-HU"/>
+        </w:rPr>
+      </w:pPr>
+      <w:r>
+        <w:rPr>
+          <w:b/>
+          <w:bCs/>
+          <w:lang w:val="hu-HU"/>
+        </w:rPr>
+        <w:t>- lejátszott mérkőzések száma,</w:t>
+      </w:r>
+    </w:p>
+    <w:p>
+      <w:pPr>
+        <w:ind w:left="720"/>
+        <w:rPr>
+          <w:b/>
+          <w:bCs/>
+          <w:lang w:val="hu-HU"/>
+        </w:rPr>
+      </w:pPr>
+      <w:r>
+        <w:rPr>
+          <w:b/>
+          <w:bCs/>
+          <w:lang w:val="hu-HU"/>
+        </w:rPr>
+        <w:t>- győzelmek, döntetlenek és vereségek száma,</w:t>
+      </w:r>
+    </w:p>
+    <w:p>
+      <w:pPr>
+        <w:ind w:left="720"/>
+        <w:rPr>
+          <w:b/>
+          <w:bCs/>
+          <w:lang w:val="hu-HU"/>
+        </w:rPr>
+      </w:pPr>
+      <w:r>
+        <w:rPr>
+          <w:b/>
+          <w:bCs/>
+          <w:lang w:val="hu-HU"/>
+        </w:rPr>
+        <w:t>- rúgott és kapott gólok,</w:t>
+      </w:r>
+    </w:p>
+    <w:p>
+      <w:pPr>
+        <w:ind w:left="720"/>
+        <w:rPr>
+          <w:b/>
+          <w:bCs/>
+          <w:lang w:val="hu-HU"/>
+        </w:rPr>
+      </w:pPr>
+      <w:r>
+        <w:rPr>
+          <w:b/>
+          <w:bCs/>
+          <w:lang w:val="hu-HU"/>
+        </w:rPr>
+        <w:t>- megtartott edzések száma,</w:t>
+      </w:r>
+    </w:p>
+    <w:p>
+      <w:pPr>
+        <w:ind w:left="720"/>
+        <w:rPr>
+          <w:b/>
+          <w:bCs/>
+          <w:lang w:val="hu-HU"/>
+        </w:rPr>
+      </w:pPr>
+      <w:r>
+        <w:rPr>
+          <w:b/>
+          <w:bCs/>
+          <w:lang w:val="hu-HU"/>
+        </w:rPr>
+        <w:t>- átlagos edzéslátogatottság.</w:t>
+      </w:r>
+    </w:p>
+    <w:p>
+      <w:pPr>
+        <w:ind w:left="720"/>
+        <w:rPr>
+          <w:b/>
+          <w:bCs/>
+          <w:lang w:val="hu-HU"/>
+        </w:rPr>
+      </w:pPr>
+    </w:p>
+    <w:p>
+      <w:pPr>
+        <w:ind w:left="720"/>
+        <w:rPr>
+          <w:b/>
+          <w:bCs/>
+          <w:lang w:val="hu-HU"/>
+        </w:rPr>
+      </w:pPr>
+      <w:r>
+        <w:rPr>
+          <w:b/>
+          <w:bCs/>
+          <w:lang w:val="hu-HU"/>
+        </w:rPr>
+        <w:t xml:space="preserve"> 3. Játékosszintű statisztikák</w:t>
+      </w:r>
+    </w:p>
+    <w:p>
+      <w:pPr>
+        <w:ind w:left="720"/>
+        <w:rPr>
+          <w:b/>
+          <w:bCs/>
+          <w:lang w:val="hu-HU"/>
+        </w:rPr>
+      </w:pPr>
+    </w:p>
+    <w:p>
+      <w:pPr>
+        <w:ind w:left="720"/>
+        <w:rPr>
+          <w:b/>
+          <w:bCs/>
+          <w:lang w:val="hu-HU"/>
+        </w:rPr>
+      </w:pPr>
+      <w:r>
+        <w:rPr>
+          <w:b/>
+          <w:bCs/>
+          <w:lang w:val="hu-HU"/>
+        </w:rPr>
+        <w:lastRenderedPageBreak/>
+        <w:t>A játékosok adatlapján megtekinthetők az alábbi adatok:</w:t>
+      </w:r>
+    </w:p>
+    <w:p>
+      <w:pPr>
+        <w:ind w:left="720"/>
+        <w:rPr>
+          <w:b/>
+          <w:bCs/>
+          <w:lang w:val="hu-HU"/>
+        </w:rPr>
+      </w:pPr>
+      <w:r>
+        <w:rPr>
+          <w:b/>
+          <w:bCs/>
+          <w:lang w:val="hu-HU"/>
+        </w:rPr>
+        <w:t>- lejátszott mérkőzések száma,</w:t>
+      </w:r>
+    </w:p>
+    <w:p>
+      <w:pPr>
+        <w:ind w:left="720"/>
+        <w:rPr>
+          <w:b/>
+          <w:bCs/>
+          <w:lang w:val="hu-HU"/>
+        </w:rPr>
+      </w:pPr>
+      <w:r>
+        <w:rPr>
+          <w:b/>
+          <w:bCs/>
+          <w:lang w:val="hu-HU"/>
+        </w:rPr>
+        <w:t>- pályán töltött játékpercek,</w:t>
+      </w:r>
+    </w:p>
+    <w:p>
+      <w:pPr>
+        <w:ind w:left="720"/>
+        <w:rPr>
+          <w:b/>
+          <w:bCs/>
+          <w:lang w:val="hu-HU"/>
+        </w:rPr>
+      </w:pPr>
+      <w:r>
+        <w:rPr>
+          <w:b/>
+          <w:bCs/>
+          <w:lang w:val="hu-HU"/>
+        </w:rPr>
+        <w:t>- gólok,</w:t>
+      </w:r>
+    </w:p>
+    <w:p>
+      <w:pPr>
+        <w:ind w:left="720"/>
+        <w:rPr>
+          <w:b/>
+          <w:bCs/>
+          <w:lang w:val="hu-HU"/>
+        </w:rPr>
+      </w:pPr>
+      <w:r>
+        <w:rPr>
+          <w:b/>
+          <w:bCs/>
+          <w:lang w:val="hu-HU"/>
+        </w:rPr>
+        <w:t>- sárga és piros lapok,</w:t>
+      </w:r>
+    </w:p>
+    <w:p>
+      <w:pPr>
+        <w:ind w:left="720"/>
+        <w:rPr>
+          <w:b/>
+          <w:bCs/>
+          <w:lang w:val="hu-HU"/>
+        </w:rPr>
+      </w:pPr>
+      <w:r>
+        <w:rPr>
+          <w:b/>
+          <w:bCs/>
+          <w:lang w:val="hu-HU"/>
+        </w:rPr>
+        <w:t>- edzéslátogatottság,</w:t>
+      </w:r>
+    </w:p>
+    <w:p>
+      <w:pPr>
+        <w:ind w:left="720"/>
+        <w:rPr>
+          <w:b/>
+          <w:bCs/>
+          <w:lang w:val="hu-HU"/>
+        </w:rPr>
+      </w:pPr>
+      <w:r>
+        <w:rPr>
+          <w:b/>
+          <w:bCs/>
+          <w:lang w:val="hu-HU"/>
+        </w:rPr>
+        <w:t>- terhelési kategória.</w:t>
+      </w:r>
+    </w:p>
+    <w:p>
+      <w:pPr>
+        <w:ind w:left="720"/>
+        <w:rPr>
+          <w:b/>
+          <w:bCs/>
+          <w:lang w:val="hu-HU"/>
+        </w:rPr>
+      </w:pPr>
+    </w:p>
+    <w:p>
+      <w:pPr>
+        <w:ind w:left="720"/>
+        <w:rPr>
+          <w:b/>
+          <w:bCs/>
+          <w:lang w:val="hu-HU"/>
+        </w:rPr>
+      </w:pPr>
+      <w:r>
+        <w:rPr>
+          <w:b/>
+          <w:bCs/>
+          <w:lang w:val="hu-HU"/>
+        </w:rPr>
+        <w:t>4. Szűrés és grafikonok</w:t>
+      </w:r>
+    </w:p>
+    <w:p>
+      <w:pPr>
+        <w:ind w:left="720"/>
+        <w:rPr>
+          <w:b/>
+          <w:bCs/>
+          <w:lang w:val="hu-HU"/>
+        </w:rPr>
+      </w:pPr>
+    </w:p>
+    <w:p>
+      <w:pPr>
+        <w:ind w:left="720"/>
+        <w:rPr>
+          <w:b/>
+          <w:bCs/>
+          <w:lang w:val="hu-HU"/>
+        </w:rPr>
+      </w:pPr>
+      <w:r>
+        <w:rPr>
+          <w:b/>
+          <w:bCs/>
+          <w:lang w:val="hu-HU"/>
+        </w:rPr>
+        <w:t>A felhasználó a statisztikákat időszak, játékos vagy statisztikai kategória szerint szűrheti. A rendszer az adatokat grafikonokon is megjeleníti, és lehetőséget biztosít több játékos teljesítményének összehasonlítására.</w:t>
+      </w:r>
+    </w:p>
+    <w:p>
+      <w:pPr>
+        <w:ind w:left="720"/>
+        <w:rPr>
+          <w:b/>
+          <w:bCs/>
+          <w:lang w:val="hu-HU"/>
+        </w:rPr>
+      </w:pPr>
+    </w:p>
+    <w:p>
+      <w:pPr>
+        <w:ind w:left="720"/>
+        <w:rPr>
+          <w:b/>
+          <w:bCs/>
+          <w:lang w:val="hu-HU"/>
+        </w:rPr>
+      </w:pPr>
+      <w:r>
+        <w:rPr>
+          <w:b/>
+          <w:bCs/>
+          <w:lang w:val="hu-HU"/>
+        </w:rPr>
+        <w:t>5. Adatkezelés és jogosultságok</w:t>
+      </w:r>
+    </w:p>
+    <w:p>
+      <w:pPr>
+        <w:ind w:left="720"/>
+        <w:rPr>
+          <w:b/>
+          <w:bCs/>
+          <w:lang w:val="hu-HU"/>
+        </w:rPr>
+      </w:pPr>
+    </w:p>
+    <w:p>
+      <w:pPr>
+        <w:ind w:left="720"/>
+        <w:rPr>
+          <w:b/>
+          <w:bCs/>
+          <w:lang w:val="hu-HU"/>
+        </w:rPr>
+      </w:pPr>
+      <w:r>
+        <w:rPr>
+          <w:b/>
+          <w:bCs/>
+          <w:lang w:val="hu-HU"/>
+        </w:rPr>
+        <w:t>A statisztikák a rendszerben rögzített adatokból készülnek, és az adatok módosításakor frissülnek. A felhasználók kizárólag azoknak a csapatoknak a statisztikáit érhetik el, amelyekhez megfelelő jogosultsággal rendelkeznek.</w:t>
+      </w:r>
+    </w:p>
+    <w:p>
+      <w:pPr>
+        <w:ind w:left="720"/>
+        <w:rPr>
+          <w:b/>
+          <w:bCs/>
+          <w:lang w:val="hu-HU"/>
+        </w:rPr>
+      </w:pPr>
+    </w:p>
+    <w:p>
+      <w:pPr>
+        <w:ind w:left="720"/>
+        <w:rPr>
+          <w:b/>
+          <w:bCs/>
+          <w:lang w:val="hu-HU"/>
+        </w:rPr>
+      </w:pPr>
+      <w:r>
+        <w:rPr>
+          <w:b/>
+          <w:bCs/>
+          <w:lang w:val="hu-HU"/>
+        </w:rPr>
+        <w:t>Amennyiben nem áll rendelkezésre elegendő adat, a rendszer ezt egyértelműen jelzi.</w:t>
+      </w:r>
+    </w:p>
+    <w:p>
+      <w:pPr>
+        <w:ind w:left="720"/>
+        <w:rPr>
+          <w:b/>
+          <w:bCs/>
+          <w:lang w:val="hu-HU"/>
+        </w:rPr>
+      </w:pPr>
+    </w:p>
+    <w:p>
+      <w:pPr>
+        <w:ind w:left="720"/>
+        <w:rPr>
+          <w:b/>
+          <w:bCs/>
+          <w:sz w:val="32"/>
+          <w:szCs w:val="32"/>
+          <w:u w:val="single"/>
+          <w:lang w:val="hu-HU"/>
+        </w:rPr>
+      </w:pPr>
+      <w:r>
+        <w:rPr>
+          <w:b/>
+          <w:bCs/>
+          <w:sz w:val="32"/>
+          <w:szCs w:val="32"/>
+          <w:u w:val="single"/>
+          <w:lang w:val="hu-HU"/>
+        </w:rPr>
+        <w:t>Funkcionális specifikáció – Statisztikák exportálása</w:t>
+      </w:r>
+    </w:p>
+    <w:p>
+      <w:pPr>
+        <w:ind w:left="720"/>
+        <w:rPr>
+          <w:b/>
+          <w:bCs/>
+          <w:lang w:val="hu-HU"/>
+        </w:rPr>
+      </w:pPr>
+    </w:p>
+    <w:p>
+      <w:pPr>
+        <w:ind w:left="720"/>
+        <w:rPr>
+          <w:b/>
+          <w:bCs/>
+          <w:lang w:val="hu-HU"/>
+        </w:rPr>
+      </w:pPr>
+      <w:r>
+        <w:rPr>
+          <w:b/>
+          <w:bCs/>
+          <w:lang w:val="hu-HU"/>
+        </w:rPr>
+        <w:t>A rendszer lehetőséget biztosít a csapat- és játékosstatisztikák külső fájlba történő exportálására. A felhasználó kiválaszthatja az exportálni kívánt adatokat és az időszakot, majd CSV vagy Excel formátumban mentheti azokat.</w:t>
+      </w:r>
+    </w:p>
+    <w:p>
+      <w:pPr>
+        <w:ind w:left="720"/>
+        <w:rPr>
+          <w:b/>
+          <w:bCs/>
+          <w:lang w:val="hu-HU"/>
+        </w:rPr>
+      </w:pPr>
+    </w:p>
+    <w:p>
+      <w:pPr>
+        <w:ind w:left="720"/>
+        <w:rPr>
+          <w:b/>
+          <w:bCs/>
+          <w:lang w:val="hu-HU"/>
+        </w:rPr>
+      </w:pPr>
+      <w:r>
+        <w:rPr>
+          <w:b/>
+          <w:bCs/>
+          <w:lang w:val="hu-HU"/>
+        </w:rPr>
+        <w:lastRenderedPageBreak/>
+        <w:t>Az exportálási funkció kizárólag asztali nézetben érhető el, és csak a megfelelő jogosultsággal rendelkező felhasználók használhatják.</w:t>
+      </w:r>
+    </w:p>
+    <w:p>
+      <w:pPr>
+        <w:ind w:left="720"/>
+        <w:rPr>
+          <w:b/>
+          <w:bCs/>
+          <w:lang w:val="hu-HU"/>
+        </w:rPr>
+      </w:pPr>
+    </w:p>
+    <w:p>
+      <w:pPr>
+        <w:ind w:left="720"/>
+        <w:rPr>
+          <w:b/>
+          <w:bCs/>
+          <w:sz w:val="32"/>
+          <w:szCs w:val="32"/>
+          <w:u w:val="single"/>
+          <w:lang w:val="hu-HU"/>
+        </w:rPr>
+      </w:pPr>
+      <w:r>
+        <w:rPr>
+          <w:b/>
+          <w:bCs/>
+          <w:sz w:val="32"/>
+          <w:szCs w:val="32"/>
+          <w:u w:val="single"/>
+          <w:lang w:val="hu-HU"/>
+        </w:rPr>
+        <w:t>Funkcionális specifikáció – Naptár</w:t>
+      </w:r>
+    </w:p>
+    <w:p>
+      <w:pPr>
+        <w:ind w:left="720"/>
+        <w:rPr>
+          <w:b/>
+          <w:bCs/>
+          <w:lang w:val="hu-HU"/>
+        </w:rPr>
+      </w:pPr>
+    </w:p>
+    <w:p>
+      <w:pPr>
+        <w:ind w:left="720"/>
+        <w:rPr>
+          <w:b/>
+          <w:bCs/>
+          <w:lang w:val="hu-HU"/>
+        </w:rPr>
+      </w:pPr>
+      <w:r>
+        <w:rPr>
+          <w:b/>
+          <w:bCs/>
+          <w:lang w:val="hu-HU"/>
+        </w:rPr>
+        <w:t>A rendszer naptárfelületet biztosít a csapathoz kapcsolódó események havi áttekintésére és kezelésére.</w:t>
+      </w:r>
+    </w:p>
+    <w:p>
+      <w:pPr>
+        <w:ind w:left="720"/>
+        <w:rPr>
+          <w:b/>
+          <w:bCs/>
+          <w:lang w:val="hu-HU"/>
+        </w:rPr>
+      </w:pPr>
+    </w:p>
+    <w:p>
+      <w:pPr>
+        <w:ind w:left="720"/>
+        <w:rPr>
+          <w:b/>
+          <w:bCs/>
+          <w:lang w:val="hu-HU"/>
+        </w:rPr>
+      </w:pPr>
+      <w:r>
+        <w:rPr>
+          <w:b/>
+          <w:bCs/>
+          <w:lang w:val="hu-HU"/>
+        </w:rPr>
+        <w:t>A felhasználó a naptárban a **következő és előző hónapra navigálhat**, valamint bármikor visszatérhet az aktuális hónaphoz. A naptárban megtekintheti az adott hónapra rögzített edzéseket, mérkőzéseket és csapatösszejöveteleket.</w:t>
+      </w:r>
+    </w:p>
+    <w:p>
+      <w:pPr>
+        <w:ind w:left="720"/>
+        <w:rPr>
+          <w:b/>
+          <w:bCs/>
+          <w:lang w:val="hu-HU"/>
+        </w:rPr>
+      </w:pPr>
+    </w:p>
+    <w:p>
+      <w:pPr>
+        <w:ind w:left="720"/>
+        <w:rPr>
+          <w:b/>
+          <w:bCs/>
+          <w:lang w:val="hu-HU"/>
+        </w:rPr>
+      </w:pPr>
+      <w:r>
+        <w:rPr>
+          <w:b/>
+          <w:bCs/>
+          <w:lang w:val="hu-HU"/>
+        </w:rPr>
+        <w:t>Megfelelő jogosultság esetén új eseményeket hozhat létre, valamint módosíthatja vagy törölheti a meglévőket. Az eseményekhez megadható a megnevezés, a dátum, az időpont, a helyszín és egy rövid leírás. Egy esemény kiválasztásakor a felhasználó megtekintheti annak részletes adatait.</w:t>
+      </w:r>
+    </w:p>
+    <w:p>
+      <w:pPr>
+        <w:ind w:left="720"/>
+        <w:rPr>
+          <w:b/>
+          <w:bCs/>
+          <w:lang w:val="hu-HU"/>
+        </w:rPr>
+      </w:pPr>
+    </w:p>
+    <w:p>
+      <w:pPr>
+        <w:ind w:left="720"/>
+        <w:rPr>
+          <w:b/>
+          <w:bCs/>
+          <w:lang w:val="hu-HU"/>
+        </w:rPr>
+      </w:pPr>
+      <w:r>
+        <w:rPr>
+          <w:b/>
+          <w:bCs/>
+          <w:lang w:val="hu-HU"/>
+        </w:rPr>
+        <w:t>A naptár a rendszer saját felületének része, nem kapcsolódik külső naptárszolgáltatásokhoz. A megjelenített események az aktuálisan kiválasztott csapathoz tartoznak.</w:t>
+      </w:r>
+    </w:p>
+    <w:p>
+      <w:pPr>
+        <w:ind w:left="720"/>
+        <w:rPr>
+          <w:b/>
+          <w:bCs/>
+          <w:lang w:val="hu-HU"/>
+        </w:rPr>
+      </w:pPr>
+    </w:p>
+    <w:p>
+      <w:pPr>
+        <w:ind w:left="720"/>
+        <w:rPr>
+          <w:b/>
+          <w:bCs/>
+          <w:lang w:val="hu-HU"/>
+        </w:rPr>
+      </w:pPr>
+    </w:p>
+    <w:p>
+      <w:pPr>
+        <w:ind w:left="720"/>
+        <w:rPr>
+          <w:b/>
+          <w:bCs/>
+          <w:sz w:val="32"/>
+          <w:szCs w:val="32"/>
+          <w:u w:val="single"/>
+          <w:lang w:val="hu-HU"/>
+        </w:rPr>
+      </w:pPr>
+      <w:r>
+        <w:rPr>
+          <w:b/>
+          <w:bCs/>
+          <w:sz w:val="32"/>
+          <w:szCs w:val="32"/>
+          <w:u w:val="single"/>
+          <w:lang w:val="hu-HU"/>
+        </w:rPr>
+        <w:t>Funkcionális specifikáció – Jelenlét nyilvántartás</w:t>
+      </w:r>
+    </w:p>
+    <w:p>
+      <w:pPr>
+        <w:ind w:left="720"/>
+        <w:rPr>
+          <w:b/>
+          <w:bCs/>
+          <w:lang w:val="hu-HU"/>
+        </w:rPr>
+      </w:pPr>
+    </w:p>
+    <w:p>
+      <w:pPr>
+        <w:ind w:left="720"/>
+        <w:rPr>
+          <w:b/>
+          <w:bCs/>
+          <w:lang w:val="hu-HU"/>
+        </w:rPr>
+      </w:pPr>
+      <w:r>
+        <w:rPr>
+          <w:b/>
+          <w:bCs/>
+          <w:lang w:val="hu-HU"/>
+        </w:rPr>
+        <w:t>A rendszer lehetőséget biztosít a játékosok edzéseken és mérkőzéseken való részvételének nyilvántartására.</w:t>
+      </w:r>
+    </w:p>
+    <w:p>
+      <w:pPr>
+        <w:ind w:left="720"/>
+        <w:rPr>
+          <w:b/>
+          <w:bCs/>
+          <w:lang w:val="hu-HU"/>
+        </w:rPr>
+      </w:pPr>
+    </w:p>
+    <w:p>
+      <w:pPr>
+        <w:ind w:left="720"/>
+        <w:rPr>
+          <w:b/>
+          <w:bCs/>
+          <w:lang w:val="hu-HU"/>
+        </w:rPr>
+      </w:pPr>
+      <w:r>
+        <w:rPr>
+          <w:b/>
+          <w:bCs/>
+          <w:lang w:val="hu-HU"/>
+        </w:rPr>
+        <w:lastRenderedPageBreak/>
+        <w:t>Az edző az adott eseményhez tartozó játékoslistában minden játékos jelenléti állapotát rögzítheti. A lehetséges állapotok: **jelen van, hiányzik, igazoltan hiányzik, késve érkezett**.</w:t>
+      </w:r>
+    </w:p>
+    <w:p>
+      <w:pPr>
+        <w:ind w:left="720"/>
+        <w:rPr>
+          <w:b/>
+          <w:bCs/>
+          <w:lang w:val="hu-HU"/>
+        </w:rPr>
+      </w:pPr>
+    </w:p>
+    <w:p>
+      <w:pPr>
+        <w:ind w:left="720"/>
+        <w:rPr>
+          <w:b/>
+          <w:bCs/>
+          <w:lang w:val="hu-HU"/>
+        </w:rPr>
+      </w:pPr>
+      <w:r>
+        <w:rPr>
+          <w:b/>
+          <w:bCs/>
+          <w:lang w:val="hu-HU"/>
+        </w:rPr>
+        <w:t>A rendszer elmenti a rögzített adatokat, és játékosonként visszakereshetővé teszi azokat. A jelenléti adatok alapján a program kiszámíthatja az egyes játékosok edzéslátogatottságát, és megjelenítheti azt a statisztikák között.</w:t>
+      </w:r>
+    </w:p>
+    <w:p>
+      <w:pPr>
+        <w:ind w:left="720"/>
+        <w:rPr>
+          <w:b/>
+          <w:bCs/>
+          <w:lang w:val="hu-HU"/>
+        </w:rPr>
+      </w:pPr>
+    </w:p>
+    <w:p>
+      <w:pPr>
+        <w:ind w:left="720"/>
+        <w:rPr>
+          <w:b/>
+          <w:bCs/>
+          <w:lang w:val="hu-HU"/>
+        </w:rPr>
+      </w:pPr>
+      <w:r>
+        <w:rPr>
+          <w:b/>
+          <w:bCs/>
+          <w:lang w:val="hu-HU"/>
+        </w:rPr>
+        <w:t>A jelenlét rögzítését és módosítását csak megfelelő jogosultsággal rendelkező felhasználók végezhetik.</w:t>
+      </w:r>
+    </w:p>
+    <w:p>
+      <w:pPr>
+        <w:ind w:left="720"/>
+        <w:rPr>
+          <w:b/>
+          <w:bCs/>
+          <w:lang w:val="hu-HU"/>
+        </w:rPr>
+      </w:pPr>
+    </w:p>
+    <w:p>
+      <w:pPr>
+        <w:ind w:left="720"/>
+        <w:rPr>
+          <w:b/>
+          <w:bCs/>
+          <w:sz w:val="32"/>
+          <w:szCs w:val="32"/>
+          <w:u w:val="single"/>
+          <w:lang w:val="hu-HU"/>
+        </w:rPr>
+      </w:pPr>
+      <w:r>
+        <w:rPr>
+          <w:b/>
+          <w:bCs/>
+          <w:sz w:val="32"/>
+          <w:szCs w:val="32"/>
+          <w:u w:val="single"/>
+          <w:lang w:val="hu-HU"/>
+        </w:rPr>
+        <w:t>Funkcionális specifikáció – Kétfaktoros hitelesítés (2FA)</w:t>
+      </w:r>
+    </w:p>
+    <w:p>
+      <w:pPr>
+        <w:ind w:left="720"/>
+        <w:rPr>
+          <w:b/>
+          <w:bCs/>
+          <w:lang w:val="hu-HU"/>
+        </w:rPr>
+      </w:pPr>
+    </w:p>
+    <w:p>
+      <w:pPr>
+        <w:ind w:left="720"/>
+        <w:rPr>
+          <w:b/>
+          <w:bCs/>
+          <w:lang w:val="hu-HU"/>
+        </w:rPr>
+      </w:pPr>
+      <w:r>
+        <w:rPr>
+          <w:b/>
+          <w:bCs/>
+          <w:lang w:val="hu-HU"/>
+        </w:rPr>
+        <w:t>A rendszer lehetőséget biztosít a felhasználók számára a kétfaktoros hitelesítés bekapcsolására, amely a jelszó mellett egy további ellenőrzési lépéssel növeli a fiók biztonságát.</w:t>
+      </w:r>
+    </w:p>
+    <w:p>
+      <w:pPr>
+        <w:ind w:left="720"/>
+        <w:rPr>
+          <w:b/>
+          <w:bCs/>
+          <w:lang w:val="hu-HU"/>
+        </w:rPr>
+      </w:pPr>
+    </w:p>
+    <w:p>
+      <w:pPr>
+        <w:ind w:left="720"/>
+        <w:rPr>
+          <w:b/>
+          <w:bCs/>
+          <w:lang w:val="hu-HU"/>
+        </w:rPr>
+      </w:pPr>
+      <w:r>
+        <w:rPr>
+          <w:b/>
+          <w:bCs/>
+          <w:lang w:val="hu-HU"/>
+        </w:rPr>
+        <w:t>Bekapcsolás után a felhasználónak bejelentkezéskor a jelszó megadása mellett egy egyszer használatos ellenőrzőkódot is meg kell adnia. A kód érkezhet e-mailben, vagy előállítható hitelesítő alkalmazással.</w:t>
+      </w:r>
+    </w:p>
+    <w:p>
+      <w:pPr>
+        <w:ind w:left="720"/>
+        <w:rPr>
+          <w:b/>
+          <w:bCs/>
+          <w:lang w:val="hu-HU"/>
+        </w:rPr>
+      </w:pPr>
+    </w:p>
+    <w:p>
+      <w:pPr>
+        <w:ind w:left="720"/>
+        <w:rPr>
+          <w:b/>
+          <w:bCs/>
+          <w:lang w:val="hu-HU"/>
+        </w:rPr>
+      </w:pPr>
+      <w:r>
+        <w:rPr>
+          <w:b/>
+          <w:bCs/>
+          <w:lang w:val="hu-HU"/>
+        </w:rPr>
+        <w:t>A rendszer csak sikeres ellenőrzés esetén engedélyezi a bejelentkezést. A felhasználó a fiókbeállításokban bekapcsolhatja vagy kikapcsolhatja a funkciót, megfelelő személyazonosság-ellenőrzés mellett.</w:t>
+      </w:r>
+    </w:p>
+    <w:p>
+      <w:pPr>
+        <w:ind w:left="720"/>
+        <w:rPr>
+          <w:b/>
+          <w:bCs/>
+          <w:lang w:val="hu-HU"/>
+        </w:rPr>
+      </w:pPr>
+    </w:p>
+    <w:p>
+      <w:pPr>
+        <w:ind w:left="720"/>
+        <w:rPr>
+          <w:b/>
+          <w:bCs/>
+          <w:lang w:val="hu-HU"/>
+        </w:rPr>
+      </w:pPr>
+      <w:r>
+        <w:rPr>
+          <w:b/>
+          <w:bCs/>
+          <w:lang w:val="hu-HU"/>
+        </w:rPr>
+        <w:t>Hibás vagy lejárt kód esetén a rendszer elutasítja a hitelesítést, és tájékoztatja a felhasználót a sikertelen belépésről.</w:t>
       </w:r>
     </w:p>
     <w:sectPr>

</xml_diff>

<commit_message>
Kisebb nyelvtani hibák javítása
</commit_message>
<xml_diff>
--- a/Funkcionális specifikációk.docx
+++ b/Funkcionális specifikációk.docx
@@ -3952,7 +3952,7 @@
           <w:bCs/>
           <w:lang w:val="hu-HU"/>
         </w:rPr>
-        <w:t>A felhasználó a naptárban a **következő és előző hónapra navigálhat**, valamint bármikor visszatérhet az aktuális hónaphoz. A naptárban megtekintheti az adott hónapra rögzített edzéseket, mérkőzéseket és csapatösszejöveteleket.</w:t>
+        <w:t>A felhasználó a naptárban a következő és előző hónapra navigálhat, valamint bármikor visszatérhet az aktuális hónaphoz. A naptárban megtekintheti az adott hónapra rögzített edzéseket, mérkőzéseket és csapatösszejöveteleket.</w:t>
       </w:r>
     </w:p>
     <w:p>
@@ -4108,8 +4108,7 @@
           <w:bCs/>
           <w:lang w:val="hu-HU"/>
         </w:rPr>
-        <w:lastRenderedPageBreak/>
-        <w:t>Az edző az adott eseményhez tartozó játékoslistában minden játékos jelenléti állapotát rögzítheti. A lehetséges állapotok: **jelen van, hiányzik, igazoltan hiányzik, késve érkezett**.</w:t>
+        <w:t>Az edző az adott eseményhez tartozó játékoslistában minden játékos jelenléti állapotát rögzítheti. A lehetséges állapotok: jelen van, hiányzik, igazoltan hiányzik, késve érkezett.</w:t>
       </w:r>
     </w:p>
     <w:p>

</xml_diff>